<commit_message>
Update report with final artifact links
</commit_message>
<xml_diff>
--- a/CS360_Project-Phase 2.docx
+++ b/CS360_Project-Phase 2.docx
@@ -2485,8 +2485,19 @@
                                           <w:sz w:val="24"/>
                                           <w:szCs w:val="24"/>
                                         </w:rPr>
-                                        <w:t>Abdulrahman ALktheri</w:t>
+                                        <w:t xml:space="preserve">Abdulrahman </w:t>
                                       </w:r>
+                                      <w:proofErr w:type="spellStart"/>
+                                      <w:r>
+                                        <w:rPr>
+                                          <w:b/>
+                                          <w:bCs/>
+                                          <w:sz w:val="24"/>
+                                          <w:szCs w:val="24"/>
+                                        </w:rPr>
+                                        <w:t>ALktheri</w:t>
+                                      </w:r>
+                                      <w:proofErr w:type="spellEnd"/>
                                     </w:p>
                                     <w:p>
                                       <w:pPr>
@@ -2828,8 +2839,19 @@
                                     <w:sz w:val="24"/>
                                     <w:szCs w:val="24"/>
                                   </w:rPr>
-                                  <w:t>Abdulrahman ALktheri</w:t>
+                                  <w:t xml:space="preserve">Abdulrahman </w:t>
                                 </w:r>
+                                <w:proofErr w:type="spellStart"/>
+                                <w:r>
+                                  <w:rPr>
+                                    <w:b/>
+                                    <w:bCs/>
+                                    <w:sz w:val="24"/>
+                                    <w:szCs w:val="24"/>
+                                  </w:rPr>
+                                  <w:t>ALktheri</w:t>
+                                </w:r>
+                                <w:proofErr w:type="spellEnd"/>
                               </w:p>
                               <w:p>
                                 <w:pPr>
@@ -3881,7 +3903,47 @@
           <w:sz w:val="24"/>
           <w:szCs w:val="24"/>
         </w:rPr>
-        <w:t xml:space="preserve">A university operates two campuses: a Main Campus and a Branch Campus. Each campus network is treated as a separate WAN site. Your task is to design and configure, in Cisco Packet Tracer, a network that successfully transmits data packets from a device in any LAN of WAN 1 (Main Campus) to a device in any LAN of WAN 2 (Branch Campus). Each WAN contains 2 LANs, and each LAN has 3 end devices. </w:t>
+        <w:t xml:space="preserve">A university operates two campuses: a Main Campus and a Branch Campus. Each campus network is treated as a separate WAN site. Your task is to design and configure, in Cisco Packet Tracer, a network that successfully transmits data packets from a device in any LAN </w:t>
+      </w:r>
+      <w:proofErr w:type="spellStart"/>
+      <w:r>
+        <w:rPr>
+          <w:rFonts w:ascii="Times New Roman" w:eastAsia="Times New Roman" w:hAnsi="Times New Roman" w:cs="Times New Roman"/>
+          <w:color w:val="auto"/>
+          <w:sz w:val="24"/>
+          <w:szCs w:val="24"/>
+        </w:rPr>
+        <w:t>of</w:t>
+      </w:r>
+      <w:proofErr w:type="spellEnd"/>
+      <w:r>
+        <w:rPr>
+          <w:rFonts w:ascii="Times New Roman" w:eastAsia="Times New Roman" w:hAnsi="Times New Roman" w:cs="Times New Roman"/>
+          <w:color w:val="auto"/>
+          <w:sz w:val="24"/>
+          <w:szCs w:val="24"/>
+        </w:rPr>
+        <w:t xml:space="preserve"> WAN 1 (Main Campus) to a device in any LAN </w:t>
+      </w:r>
+      <w:proofErr w:type="spellStart"/>
+      <w:r>
+        <w:rPr>
+          <w:rFonts w:ascii="Times New Roman" w:eastAsia="Times New Roman" w:hAnsi="Times New Roman" w:cs="Times New Roman"/>
+          <w:color w:val="auto"/>
+          <w:sz w:val="24"/>
+          <w:szCs w:val="24"/>
+        </w:rPr>
+        <w:t>of</w:t>
+      </w:r>
+      <w:proofErr w:type="spellEnd"/>
+      <w:r>
+        <w:rPr>
+          <w:rFonts w:ascii="Times New Roman" w:eastAsia="Times New Roman" w:hAnsi="Times New Roman" w:cs="Times New Roman"/>
+          <w:color w:val="auto"/>
+          <w:sz w:val="24"/>
+          <w:szCs w:val="24"/>
+        </w:rPr>
+        <w:t xml:space="preserve"> WAN 2 (Branch Campus). Each WAN contains 2 LANs, and each LAN has 3 end devices. </w:t>
       </w:r>
     </w:p>
     <w:p>
@@ -5131,7 +5193,47 @@
           <w:sz w:val="24"/>
           <w:szCs w:val="24"/>
         </w:rPr>
-        <w:t>Use the ping command to test connectivity between a device in any LAN of WAN 1 and a device in any LAN of WAN 2.</w:t>
+        <w:t xml:space="preserve">Use the ping command to test connectivity between a device in any LAN </w:t>
+      </w:r>
+      <w:proofErr w:type="spellStart"/>
+      <w:r>
+        <w:rPr>
+          <w:rFonts w:ascii="Times New Roman" w:eastAsia="Times New Roman" w:hAnsi="Times New Roman" w:cs="Times New Roman"/>
+          <w:color w:val="auto"/>
+          <w:sz w:val="24"/>
+          <w:szCs w:val="24"/>
+        </w:rPr>
+        <w:t>of</w:t>
+      </w:r>
+      <w:proofErr w:type="spellEnd"/>
+      <w:r>
+        <w:rPr>
+          <w:rFonts w:ascii="Times New Roman" w:eastAsia="Times New Roman" w:hAnsi="Times New Roman" w:cs="Times New Roman"/>
+          <w:color w:val="auto"/>
+          <w:sz w:val="24"/>
+          <w:szCs w:val="24"/>
+        </w:rPr>
+        <w:t xml:space="preserve"> WAN 1 and a device in any LAN </w:t>
+      </w:r>
+      <w:proofErr w:type="spellStart"/>
+      <w:r>
+        <w:rPr>
+          <w:rFonts w:ascii="Times New Roman" w:eastAsia="Times New Roman" w:hAnsi="Times New Roman" w:cs="Times New Roman"/>
+          <w:color w:val="auto"/>
+          <w:sz w:val="24"/>
+          <w:szCs w:val="24"/>
+        </w:rPr>
+        <w:t>of</w:t>
+      </w:r>
+      <w:proofErr w:type="spellEnd"/>
+      <w:r>
+        <w:rPr>
+          <w:rFonts w:ascii="Times New Roman" w:eastAsia="Times New Roman" w:hAnsi="Times New Roman" w:cs="Times New Roman"/>
+          <w:color w:val="auto"/>
+          <w:sz w:val="24"/>
+          <w:szCs w:val="24"/>
+        </w:rPr>
+        <w:t xml:space="preserve"> WAN 2.</w:t>
       </w:r>
     </w:p>
     <w:p>
@@ -5317,7 +5419,25 @@
           <w:sz w:val="24"/>
           <w:szCs w:val="24"/>
         </w:rPr>
-        <w:t>Show screenshots of IP address, subnet mask, and default gateway assignment on at least one end device in each LAN, and the commands used to configure the router LAN interfaces (e.g., interface, ip address, no shutdown). (2 marks)</w:t>
+        <w:t xml:space="preserve">Show screenshots of IP address, subnet mask, and default gateway assignment on at least one end device in each LAN, and the commands used to configure the router LAN interfaces (e.g., interface, </w:t>
+      </w:r>
+      <w:proofErr w:type="spellStart"/>
+      <w:r>
+        <w:rPr>
+          <w:rFonts w:ascii="Times New Roman" w:eastAsia="Times New Roman" w:hAnsi="Times New Roman" w:cs="Times New Roman"/>
+          <w:sz w:val="24"/>
+          <w:szCs w:val="24"/>
+        </w:rPr>
+        <w:t>ip</w:t>
+      </w:r>
+      <w:proofErr w:type="spellEnd"/>
+      <w:r>
+        <w:rPr>
+          <w:rFonts w:ascii="Times New Roman" w:eastAsia="Times New Roman" w:hAnsi="Times New Roman" w:cs="Times New Roman"/>
+          <w:sz w:val="24"/>
+          <w:szCs w:val="24"/>
+        </w:rPr>
+        <w:t xml:space="preserve"> address, no shutdown). (2 marks)</w:t>
       </w:r>
     </w:p>
     <w:p>
@@ -6554,7 +6674,29 @@
           <w:szCs w:val="24"/>
           <w:lang w:val="fr-FR"/>
         </w:rPr>
-        <w:t>Router(config)# hostname Router2</w:t>
+        <w:t xml:space="preserve">Router(config)# </w:t>
+      </w:r>
+      <w:proofErr w:type="spellStart"/>
+      <w:r>
+        <w:rPr>
+          <w:rFonts w:ascii="Times New Roman" w:eastAsia="Times New Roman" w:hAnsi="Times New Roman" w:cs="Times New Roman"/>
+          <w:color w:val="auto"/>
+          <w:sz w:val="24"/>
+          <w:szCs w:val="24"/>
+          <w:lang w:val="fr-FR"/>
+        </w:rPr>
+        <w:t>hostname</w:t>
+      </w:r>
+      <w:proofErr w:type="spellEnd"/>
+      <w:r>
+        <w:rPr>
+          <w:rFonts w:ascii="Times New Roman" w:eastAsia="Times New Roman" w:hAnsi="Times New Roman" w:cs="Times New Roman"/>
+          <w:color w:val="auto"/>
+          <w:sz w:val="24"/>
+          <w:szCs w:val="24"/>
+          <w:lang w:val="fr-FR"/>
+        </w:rPr>
+        <w:t xml:space="preserve"> Router2</w:t>
       </w:r>
     </w:p>
     <w:p>
@@ -6868,7 +7010,51 @@
           <w:szCs w:val="24"/>
           <w:lang w:val="en-GB"/>
         </w:rPr>
-        <w:t xml:space="preserve"> Used for all connections between the PCs and Switch ports (e.g., FastEthernet ports), as well as between the Switch uplink ports and Router interfaces (e.g., GigabitEthernet ports). </w:t>
+        <w:t xml:space="preserve"> Used for all connections between the PCs and Switch ports (e.g., </w:t>
+      </w:r>
+      <w:proofErr w:type="spellStart"/>
+      <w:r>
+        <w:rPr>
+          <w:rFonts w:ascii="Times New Roman" w:eastAsia="Times New Roman" w:hAnsi="Times New Roman" w:cs="Times New Roman"/>
+          <w:color w:val="auto"/>
+          <w:sz w:val="24"/>
+          <w:szCs w:val="24"/>
+          <w:lang w:val="en-GB"/>
+        </w:rPr>
+        <w:t>FastEthernet</w:t>
+      </w:r>
+      <w:proofErr w:type="spellEnd"/>
+      <w:r>
+        <w:rPr>
+          <w:rFonts w:ascii="Times New Roman" w:eastAsia="Times New Roman" w:hAnsi="Times New Roman" w:cs="Times New Roman"/>
+          <w:color w:val="auto"/>
+          <w:sz w:val="24"/>
+          <w:szCs w:val="24"/>
+          <w:lang w:val="en-GB"/>
+        </w:rPr>
+        <w:t xml:space="preserve"> ports), as well as between the Switch uplink ports and Router interfaces (e.g., </w:t>
+      </w:r>
+      <w:proofErr w:type="spellStart"/>
+      <w:r>
+        <w:rPr>
+          <w:rFonts w:ascii="Times New Roman" w:eastAsia="Times New Roman" w:hAnsi="Times New Roman" w:cs="Times New Roman"/>
+          <w:color w:val="auto"/>
+          <w:sz w:val="24"/>
+          <w:szCs w:val="24"/>
+          <w:lang w:val="en-GB"/>
+        </w:rPr>
+        <w:t>GigabitEthernet</w:t>
+      </w:r>
+      <w:proofErr w:type="spellEnd"/>
+      <w:r>
+        <w:rPr>
+          <w:rFonts w:ascii="Times New Roman" w:eastAsia="Times New Roman" w:hAnsi="Times New Roman" w:cs="Times New Roman"/>
+          <w:color w:val="auto"/>
+          <w:sz w:val="24"/>
+          <w:szCs w:val="24"/>
+          <w:lang w:val="en-GB"/>
+        </w:rPr>
+        <w:t xml:space="preserve"> ports). </w:t>
       </w:r>
     </w:p>
     <w:p>
@@ -6946,7 +7132,7 @@
           </mc:Choice>
           <mc:Fallback>
             <w:pict>
-              <v:shapetype w14:anchorId="670FFFA1" id="_x0000_t75" coordsize="21600,21600" o:spt="75" o:preferrelative="t" path="m@4@5l@4@11@9@11@9@5xe" filled="f" stroked="f">
+              <v:shapetype w14:anchorId="20824CDD" id="_x0000_t75" coordsize="21600,21600" o:spt="75" o:preferrelative="t" path="m@4@5l@4@11@9@11@9@5xe" filled="f" stroked="f">
                 <v:stroke joinstyle="miter"/>
                 <v:formulas>
                   <v:f eqn="if lineDrawn pixelLineWidth 0"/>
@@ -7003,7 +7189,33 @@
           <w:szCs w:val="24"/>
           <w:lang w:val="es-ES"/>
         </w:rPr>
-        <w:t>Serial DCE/DTE Cables (Red Zig-Zag Line):</w:t>
+        <w:t xml:space="preserve">Serial DCE/DTE Cables (Red </w:t>
+      </w:r>
+      <w:proofErr w:type="spellStart"/>
+      <w:r>
+        <w:rPr>
+          <w:rFonts w:ascii="Times New Roman" w:eastAsia="Times New Roman" w:hAnsi="Times New Roman" w:cs="Times New Roman"/>
+          <w:b/>
+          <w:bCs/>
+          <w:color w:val="auto"/>
+          <w:sz w:val="24"/>
+          <w:szCs w:val="24"/>
+          <w:lang w:val="es-ES"/>
+        </w:rPr>
+        <w:t>Zig-Zag</w:t>
+      </w:r>
+      <w:proofErr w:type="spellEnd"/>
+      <w:r>
+        <w:rPr>
+          <w:rFonts w:ascii="Times New Roman" w:eastAsia="Times New Roman" w:hAnsi="Times New Roman" w:cs="Times New Roman"/>
+          <w:b/>
+          <w:bCs/>
+          <w:color w:val="auto"/>
+          <w:sz w:val="24"/>
+          <w:szCs w:val="24"/>
+          <w:lang w:val="es-ES"/>
+        </w:rPr>
+        <w:t xml:space="preserve"> Line):</w:t>
       </w:r>
     </w:p>
     <w:p>
@@ -7277,7 +7489,29 @@
           <w:szCs w:val="24"/>
           <w:lang w:val="en-GB"/>
         </w:rPr>
-        <w:t xml:space="preserve"> To enable local and remote routing, each Local Area Network (LAN) was assigned a unique IPv4 subnet. Default gateways were assigned to the router's local GigabitEthernet interface for each subnet: </w:t>
+        <w:t xml:space="preserve"> To enable local and remote routing, each Local Area Network (LAN) was assigned a unique IPv4 subnet. Default gateways were assigned to the router's local </w:t>
+      </w:r>
+      <w:proofErr w:type="spellStart"/>
+      <w:r>
+        <w:rPr>
+          <w:rFonts w:ascii="Times New Roman" w:eastAsia="Times New Roman" w:hAnsi="Times New Roman" w:cs="Times New Roman"/>
+          <w:color w:val="auto"/>
+          <w:sz w:val="24"/>
+          <w:szCs w:val="24"/>
+          <w:lang w:val="en-GB"/>
+        </w:rPr>
+        <w:t>GigabitEthernet</w:t>
+      </w:r>
+      <w:proofErr w:type="spellEnd"/>
+      <w:r>
+        <w:rPr>
+          <w:rFonts w:ascii="Times New Roman" w:eastAsia="Times New Roman" w:hAnsi="Times New Roman" w:cs="Times New Roman"/>
+          <w:color w:val="auto"/>
+          <w:sz w:val="24"/>
+          <w:szCs w:val="24"/>
+          <w:lang w:val="en-GB"/>
+        </w:rPr>
+        <w:t xml:space="preserve"> interface for each subnet: </w:t>
       </w:r>
     </w:p>
     <w:p>
@@ -7808,19 +8042,9 @@
           <w:szCs w:val="24"/>
           <w:lang w:val="fr-FR"/>
         </w:rPr>
-        <w:t>Router LAN Interface Configuration Commands:</w:t>
-      </w:r>
-    </w:p>
-    <w:p>
-      <w:pPr>
-        <w:rPr>
-          <w:rFonts w:ascii="Times New Roman" w:eastAsia="Times New Roman" w:hAnsi="Times New Roman" w:cs="Times New Roman"/>
-          <w:color w:val="auto"/>
-          <w:sz w:val="24"/>
-          <w:szCs w:val="24"/>
-          <w:lang w:val="en-GB"/>
-        </w:rPr>
-      </w:pPr>
+        <w:t xml:space="preserve">Router LAN Interface Configuration </w:t>
+      </w:r>
+      <w:proofErr w:type="spellStart"/>
       <w:r>
         <w:rPr>
           <w:rFonts w:ascii="Times New Roman" w:eastAsia="Times New Roman" w:hAnsi="Times New Roman" w:cs="Times New Roman"/>
@@ -7829,234 +8053,12 @@
           <w:color w:val="auto"/>
           <w:sz w:val="24"/>
           <w:szCs w:val="24"/>
-          <w:lang w:val="en-GB"/>
-        </w:rPr>
-        <w:t>Router 1 Configuration:</w:t>
-      </w:r>
-    </w:p>
-    <w:p>
-      <w:pPr>
-        <w:rPr>
-          <w:rFonts w:ascii="Times New Roman" w:eastAsia="Times New Roman" w:hAnsi="Times New Roman" w:cs="Times New Roman"/>
-          <w:color w:val="auto"/>
-          <w:sz w:val="24"/>
-          <w:szCs w:val="24"/>
-          <w:lang w:val="en-GB"/>
-        </w:rPr>
-      </w:pPr>
-      <w:r>
-        <w:rPr>
-          <w:rFonts w:ascii="Times New Roman" w:eastAsia="Times New Roman" w:hAnsi="Times New Roman" w:cs="Times New Roman"/>
-          <w:color w:val="auto"/>
-          <w:sz w:val="24"/>
-          <w:szCs w:val="24"/>
-          <w:lang w:val="en-GB"/>
-        </w:rPr>
-        <w:t>Router1# configure terminal</w:t>
-      </w:r>
-    </w:p>
-    <w:p>
-      <w:pPr>
-        <w:rPr>
-          <w:rFonts w:ascii="Times New Roman" w:eastAsia="Times New Roman" w:hAnsi="Times New Roman" w:cs="Times New Roman"/>
-          <w:color w:val="auto"/>
-          <w:sz w:val="24"/>
-          <w:szCs w:val="24"/>
-          <w:lang w:val="en-GB"/>
-        </w:rPr>
-      </w:pPr>
-      <w:r>
-        <w:rPr>
-          <w:rFonts w:ascii="Times New Roman" w:eastAsia="Times New Roman" w:hAnsi="Times New Roman" w:cs="Times New Roman"/>
-          <w:color w:val="auto"/>
-          <w:sz w:val="24"/>
-          <w:szCs w:val="24"/>
-          <w:lang w:val="en-GB"/>
-        </w:rPr>
-        <w:t>Router1(config)# interface GigabitEthernet0/0/0</w:t>
-      </w:r>
-    </w:p>
-    <w:p>
-      <w:pPr>
-        <w:rPr>
-          <w:rFonts w:ascii="Times New Roman" w:eastAsia="Times New Roman" w:hAnsi="Times New Roman" w:cs="Times New Roman"/>
-          <w:color w:val="auto"/>
-          <w:sz w:val="24"/>
-          <w:szCs w:val="24"/>
-          <w:lang w:val="en-GB"/>
-        </w:rPr>
-      </w:pPr>
-      <w:r>
-        <w:rPr>
-          <w:rFonts w:ascii="Times New Roman" w:eastAsia="Times New Roman" w:hAnsi="Times New Roman" w:cs="Times New Roman"/>
-          <w:color w:val="auto"/>
-          <w:sz w:val="24"/>
-          <w:szCs w:val="24"/>
-          <w:lang w:val="en-GB"/>
-        </w:rPr>
-        <w:t>Router1(config-if)# ip address 172.16.10.1 255.255.255.0</w:t>
-      </w:r>
-    </w:p>
-    <w:p>
-      <w:pPr>
-        <w:rPr>
-          <w:rFonts w:ascii="Times New Roman" w:eastAsia="Times New Roman" w:hAnsi="Times New Roman" w:cs="Times New Roman"/>
-          <w:color w:val="auto"/>
-          <w:sz w:val="24"/>
-          <w:szCs w:val="24"/>
-          <w:lang w:val="en-GB"/>
-        </w:rPr>
-      </w:pPr>
-      <w:r>
-        <w:rPr>
-          <w:rFonts w:ascii="Times New Roman" w:eastAsia="Times New Roman" w:hAnsi="Times New Roman" w:cs="Times New Roman"/>
-          <w:color w:val="auto"/>
-          <w:sz w:val="24"/>
-          <w:szCs w:val="24"/>
-          <w:lang w:val="en-GB"/>
-        </w:rPr>
-        <w:t>Router1(config-if)# no shutdown</w:t>
-      </w:r>
-    </w:p>
-    <w:p>
-      <w:pPr>
-        <w:rPr>
-          <w:rFonts w:ascii="Times New Roman" w:eastAsia="Times New Roman" w:hAnsi="Times New Roman" w:cs="Times New Roman"/>
-          <w:color w:val="auto"/>
-          <w:sz w:val="24"/>
-          <w:szCs w:val="24"/>
-          <w:lang w:val="en-GB"/>
-        </w:rPr>
-      </w:pPr>
-      <w:r>
-        <w:rPr>
-          <w:rFonts w:ascii="Times New Roman" w:eastAsia="Times New Roman" w:hAnsi="Times New Roman" w:cs="Times New Roman"/>
-          <w:color w:val="auto"/>
-          <w:sz w:val="24"/>
-          <w:szCs w:val="24"/>
-          <w:lang w:val="en-GB"/>
-        </w:rPr>
-        <w:t>Router1(config-if)# exit</w:t>
-      </w:r>
-    </w:p>
-    <w:p>
-      <w:pPr>
-        <w:rPr>
-          <w:rFonts w:ascii="Times New Roman" w:eastAsia="Times New Roman" w:hAnsi="Times New Roman" w:cs="Times New Roman"/>
-          <w:color w:val="auto"/>
-          <w:sz w:val="24"/>
-          <w:szCs w:val="24"/>
-          <w:lang w:val="en-GB"/>
-        </w:rPr>
-      </w:pPr>
-      <w:r>
-        <w:rPr>
-          <w:rFonts w:ascii="Times New Roman" w:eastAsia="Times New Roman" w:hAnsi="Times New Roman" w:cs="Times New Roman"/>
-          <w:color w:val="auto"/>
-          <w:sz w:val="24"/>
-          <w:szCs w:val="24"/>
-          <w:lang w:val="en-GB"/>
-        </w:rPr>
-        <w:t>Router1(config)# interface GigabitEthernet0/0/1</w:t>
-      </w:r>
-    </w:p>
-    <w:p>
-      <w:pPr>
-        <w:rPr>
-          <w:rFonts w:ascii="Times New Roman" w:eastAsia="Times New Roman" w:hAnsi="Times New Roman" w:cs="Times New Roman"/>
-          <w:color w:val="auto"/>
-          <w:sz w:val="24"/>
-          <w:szCs w:val="24"/>
-          <w:lang w:val="en-GB"/>
-        </w:rPr>
-      </w:pPr>
-      <w:r>
-        <w:rPr>
-          <w:rFonts w:ascii="Times New Roman" w:eastAsia="Times New Roman" w:hAnsi="Times New Roman" w:cs="Times New Roman"/>
-          <w:color w:val="auto"/>
-          <w:sz w:val="24"/>
-          <w:szCs w:val="24"/>
-          <w:lang w:val="en-GB"/>
-        </w:rPr>
-        <w:t>Router1(config-if)# ip address 172.16.20.1 255.255.255.0</w:t>
-      </w:r>
-    </w:p>
-    <w:p>
-      <w:pPr>
-        <w:rPr>
-          <w:rFonts w:ascii="Times New Roman" w:eastAsia="Times New Roman" w:hAnsi="Times New Roman" w:cs="Times New Roman"/>
-          <w:color w:val="auto"/>
-          <w:sz w:val="24"/>
-          <w:szCs w:val="24"/>
-          <w:lang w:val="en-GB"/>
-        </w:rPr>
-      </w:pPr>
-      <w:r>
-        <w:rPr>
-          <w:rFonts w:ascii="Times New Roman" w:eastAsia="Times New Roman" w:hAnsi="Times New Roman" w:cs="Times New Roman"/>
-          <w:color w:val="auto"/>
-          <w:sz w:val="24"/>
-          <w:szCs w:val="24"/>
-          <w:lang w:val="en-GB"/>
-        </w:rPr>
-        <w:t>Router1(config-if)# no shutdown</w:t>
-      </w:r>
-    </w:p>
-    <w:p>
-      <w:pPr>
-        <w:rPr>
-          <w:rFonts w:ascii="Times New Roman" w:eastAsia="Times New Roman" w:hAnsi="Times New Roman" w:cs="Times New Roman"/>
-          <w:color w:val="auto"/>
-          <w:sz w:val="24"/>
-          <w:szCs w:val="24"/>
-          <w:lang w:val="en-GB"/>
-        </w:rPr>
-      </w:pPr>
-      <w:r>
-        <w:rPr>
-          <w:rFonts w:ascii="Times New Roman" w:eastAsia="Times New Roman" w:hAnsi="Times New Roman" w:cs="Times New Roman"/>
-          <w:color w:val="auto"/>
-          <w:sz w:val="24"/>
-          <w:szCs w:val="24"/>
-          <w:lang w:val="en-GB"/>
-        </w:rPr>
-        <w:t>Router1(config-if)# exit</w:t>
-      </w:r>
-    </w:p>
-    <w:p>
-      <w:pPr>
-        <w:rPr>
-          <w:rFonts w:ascii="Times New Roman" w:eastAsia="Times New Roman" w:hAnsi="Times New Roman" w:cs="Times New Roman"/>
-          <w:color w:val="auto"/>
-          <w:sz w:val="24"/>
-          <w:szCs w:val="24"/>
-          <w:lang w:val="en-GB"/>
-        </w:rPr>
-      </w:pPr>
-      <w:r>
-        <w:rPr>
-          <w:rFonts w:ascii="Times New Roman" w:eastAsia="Times New Roman" w:hAnsi="Times New Roman" w:cs="Times New Roman"/>
-          <w:color w:val="auto"/>
-          <w:sz w:val="24"/>
-          <w:szCs w:val="24"/>
-          <w:lang w:val="en-GB"/>
-        </w:rPr>
-        <w:t>Router1# write</w:t>
-      </w:r>
-    </w:p>
-    <w:p>
-      <w:pPr>
-        <w:rPr>
-          <w:rFonts w:ascii="Times New Roman" w:eastAsia="Times New Roman" w:hAnsi="Times New Roman" w:cs="Times New Roman"/>
-          <w:color w:val="auto"/>
-          <w:sz w:val="24"/>
-          <w:szCs w:val="24"/>
-          <w:lang w:val="en-GB"/>
-        </w:rPr>
-      </w:pPr>
-    </w:p>
-    <w:p>
-      <w:pPr>
+          <w:lang w:val="fr-FR"/>
+        </w:rPr>
+        <w:t>Commands</w:t>
+      </w:r>
+      <w:proofErr w:type="spellEnd"/>
+      <w:r>
         <w:rPr>
           <w:rFonts w:ascii="Times New Roman" w:eastAsia="Times New Roman" w:hAnsi="Times New Roman" w:cs="Times New Roman"/>
           <w:b/>
@@ -8064,6 +8066,19 @@
           <w:color w:val="auto"/>
           <w:sz w:val="24"/>
           <w:szCs w:val="24"/>
+          <w:lang w:val="fr-FR"/>
+        </w:rPr>
+        <w:t>:</w:t>
+      </w:r>
+    </w:p>
+    <w:p>
+      <w:pPr>
+        <w:rPr>
+          <w:rFonts w:ascii="Times New Roman" w:eastAsia="Times New Roman" w:hAnsi="Times New Roman" w:cs="Times New Roman"/>
+          <w:color w:val="auto"/>
+          <w:sz w:val="24"/>
+          <w:szCs w:val="24"/>
+          <w:lang w:val="en-GB"/>
         </w:rPr>
       </w:pPr>
       <w:r>
@@ -8074,6 +8089,295 @@
           <w:color w:val="auto"/>
           <w:sz w:val="24"/>
           <w:szCs w:val="24"/>
+          <w:lang w:val="en-GB"/>
+        </w:rPr>
+        <w:t>Router 1 Configuration:</w:t>
+      </w:r>
+    </w:p>
+    <w:p>
+      <w:pPr>
+        <w:rPr>
+          <w:rFonts w:ascii="Times New Roman" w:eastAsia="Times New Roman" w:hAnsi="Times New Roman" w:cs="Times New Roman"/>
+          <w:color w:val="auto"/>
+          <w:sz w:val="24"/>
+          <w:szCs w:val="24"/>
+          <w:lang w:val="en-GB"/>
+        </w:rPr>
+      </w:pPr>
+      <w:r>
+        <w:rPr>
+          <w:rFonts w:ascii="Times New Roman" w:eastAsia="Times New Roman" w:hAnsi="Times New Roman" w:cs="Times New Roman"/>
+          <w:color w:val="auto"/>
+          <w:sz w:val="24"/>
+          <w:szCs w:val="24"/>
+          <w:lang w:val="en-GB"/>
+        </w:rPr>
+        <w:t>Router1# configure terminal</w:t>
+      </w:r>
+    </w:p>
+    <w:p>
+      <w:pPr>
+        <w:rPr>
+          <w:rFonts w:ascii="Times New Roman" w:eastAsia="Times New Roman" w:hAnsi="Times New Roman" w:cs="Times New Roman"/>
+          <w:color w:val="auto"/>
+          <w:sz w:val="24"/>
+          <w:szCs w:val="24"/>
+          <w:lang w:val="en-GB"/>
+        </w:rPr>
+      </w:pPr>
+      <w:r>
+        <w:rPr>
+          <w:rFonts w:ascii="Times New Roman" w:eastAsia="Times New Roman" w:hAnsi="Times New Roman" w:cs="Times New Roman"/>
+          <w:color w:val="auto"/>
+          <w:sz w:val="24"/>
+          <w:szCs w:val="24"/>
+          <w:lang w:val="en-GB"/>
+        </w:rPr>
+        <w:t>Router1(config)# interface GigabitEthernet0/0/0</w:t>
+      </w:r>
+    </w:p>
+    <w:p>
+      <w:pPr>
+        <w:rPr>
+          <w:rFonts w:ascii="Times New Roman" w:eastAsia="Times New Roman" w:hAnsi="Times New Roman" w:cs="Times New Roman"/>
+          <w:color w:val="auto"/>
+          <w:sz w:val="24"/>
+          <w:szCs w:val="24"/>
+          <w:lang w:val="en-GB"/>
+        </w:rPr>
+      </w:pPr>
+      <w:r>
+        <w:rPr>
+          <w:rFonts w:ascii="Times New Roman" w:eastAsia="Times New Roman" w:hAnsi="Times New Roman" w:cs="Times New Roman"/>
+          <w:color w:val="auto"/>
+          <w:sz w:val="24"/>
+          <w:szCs w:val="24"/>
+          <w:lang w:val="en-GB"/>
+        </w:rPr>
+        <w:t xml:space="preserve">Router1(config-if)# </w:t>
+      </w:r>
+      <w:proofErr w:type="spellStart"/>
+      <w:r>
+        <w:rPr>
+          <w:rFonts w:ascii="Times New Roman" w:eastAsia="Times New Roman" w:hAnsi="Times New Roman" w:cs="Times New Roman"/>
+          <w:color w:val="auto"/>
+          <w:sz w:val="24"/>
+          <w:szCs w:val="24"/>
+          <w:lang w:val="en-GB"/>
+        </w:rPr>
+        <w:t>ip</w:t>
+      </w:r>
+      <w:proofErr w:type="spellEnd"/>
+      <w:r>
+        <w:rPr>
+          <w:rFonts w:ascii="Times New Roman" w:eastAsia="Times New Roman" w:hAnsi="Times New Roman" w:cs="Times New Roman"/>
+          <w:color w:val="auto"/>
+          <w:sz w:val="24"/>
+          <w:szCs w:val="24"/>
+          <w:lang w:val="en-GB"/>
+        </w:rPr>
+        <w:t xml:space="preserve"> address 172.16.10.1 255.255.255.0</w:t>
+      </w:r>
+    </w:p>
+    <w:p>
+      <w:pPr>
+        <w:rPr>
+          <w:rFonts w:ascii="Times New Roman" w:eastAsia="Times New Roman" w:hAnsi="Times New Roman" w:cs="Times New Roman"/>
+          <w:color w:val="auto"/>
+          <w:sz w:val="24"/>
+          <w:szCs w:val="24"/>
+          <w:lang w:val="en-GB"/>
+        </w:rPr>
+      </w:pPr>
+      <w:r>
+        <w:rPr>
+          <w:rFonts w:ascii="Times New Roman" w:eastAsia="Times New Roman" w:hAnsi="Times New Roman" w:cs="Times New Roman"/>
+          <w:color w:val="auto"/>
+          <w:sz w:val="24"/>
+          <w:szCs w:val="24"/>
+          <w:lang w:val="en-GB"/>
+        </w:rPr>
+        <w:t>Router1(config-if)# no shutdown</w:t>
+      </w:r>
+    </w:p>
+    <w:p>
+      <w:pPr>
+        <w:rPr>
+          <w:rFonts w:ascii="Times New Roman" w:eastAsia="Times New Roman" w:hAnsi="Times New Roman" w:cs="Times New Roman"/>
+          <w:color w:val="auto"/>
+          <w:sz w:val="24"/>
+          <w:szCs w:val="24"/>
+          <w:lang w:val="en-GB"/>
+        </w:rPr>
+      </w:pPr>
+      <w:r>
+        <w:rPr>
+          <w:rFonts w:ascii="Times New Roman" w:eastAsia="Times New Roman" w:hAnsi="Times New Roman" w:cs="Times New Roman"/>
+          <w:color w:val="auto"/>
+          <w:sz w:val="24"/>
+          <w:szCs w:val="24"/>
+          <w:lang w:val="en-GB"/>
+        </w:rPr>
+        <w:t>Router1(config-if)# exit</w:t>
+      </w:r>
+    </w:p>
+    <w:p>
+      <w:pPr>
+        <w:rPr>
+          <w:rFonts w:ascii="Times New Roman" w:eastAsia="Times New Roman" w:hAnsi="Times New Roman" w:cs="Times New Roman"/>
+          <w:color w:val="auto"/>
+          <w:sz w:val="24"/>
+          <w:szCs w:val="24"/>
+          <w:lang w:val="en-GB"/>
+        </w:rPr>
+      </w:pPr>
+      <w:r>
+        <w:rPr>
+          <w:rFonts w:ascii="Times New Roman" w:eastAsia="Times New Roman" w:hAnsi="Times New Roman" w:cs="Times New Roman"/>
+          <w:color w:val="auto"/>
+          <w:sz w:val="24"/>
+          <w:szCs w:val="24"/>
+          <w:lang w:val="en-GB"/>
+        </w:rPr>
+        <w:t>Router1(config)# interface GigabitEthernet0/0/1</w:t>
+      </w:r>
+    </w:p>
+    <w:p>
+      <w:pPr>
+        <w:rPr>
+          <w:rFonts w:ascii="Times New Roman" w:eastAsia="Times New Roman" w:hAnsi="Times New Roman" w:cs="Times New Roman"/>
+          <w:color w:val="auto"/>
+          <w:sz w:val="24"/>
+          <w:szCs w:val="24"/>
+          <w:lang w:val="en-GB"/>
+        </w:rPr>
+      </w:pPr>
+      <w:r>
+        <w:rPr>
+          <w:rFonts w:ascii="Times New Roman" w:eastAsia="Times New Roman" w:hAnsi="Times New Roman" w:cs="Times New Roman"/>
+          <w:color w:val="auto"/>
+          <w:sz w:val="24"/>
+          <w:szCs w:val="24"/>
+          <w:lang w:val="en-GB"/>
+        </w:rPr>
+        <w:t xml:space="preserve">Router1(config-if)# </w:t>
+      </w:r>
+      <w:proofErr w:type="spellStart"/>
+      <w:r>
+        <w:rPr>
+          <w:rFonts w:ascii="Times New Roman" w:eastAsia="Times New Roman" w:hAnsi="Times New Roman" w:cs="Times New Roman"/>
+          <w:color w:val="auto"/>
+          <w:sz w:val="24"/>
+          <w:szCs w:val="24"/>
+          <w:lang w:val="en-GB"/>
+        </w:rPr>
+        <w:t>ip</w:t>
+      </w:r>
+      <w:proofErr w:type="spellEnd"/>
+      <w:r>
+        <w:rPr>
+          <w:rFonts w:ascii="Times New Roman" w:eastAsia="Times New Roman" w:hAnsi="Times New Roman" w:cs="Times New Roman"/>
+          <w:color w:val="auto"/>
+          <w:sz w:val="24"/>
+          <w:szCs w:val="24"/>
+          <w:lang w:val="en-GB"/>
+        </w:rPr>
+        <w:t xml:space="preserve"> address 172.16.20.1 255.255.255.0</w:t>
+      </w:r>
+    </w:p>
+    <w:p>
+      <w:pPr>
+        <w:rPr>
+          <w:rFonts w:ascii="Times New Roman" w:eastAsia="Times New Roman" w:hAnsi="Times New Roman" w:cs="Times New Roman"/>
+          <w:color w:val="auto"/>
+          <w:sz w:val="24"/>
+          <w:szCs w:val="24"/>
+          <w:lang w:val="en-GB"/>
+        </w:rPr>
+      </w:pPr>
+      <w:r>
+        <w:rPr>
+          <w:rFonts w:ascii="Times New Roman" w:eastAsia="Times New Roman" w:hAnsi="Times New Roman" w:cs="Times New Roman"/>
+          <w:color w:val="auto"/>
+          <w:sz w:val="24"/>
+          <w:szCs w:val="24"/>
+          <w:lang w:val="en-GB"/>
+        </w:rPr>
+        <w:t>Router1(config-if)# no shutdown</w:t>
+      </w:r>
+    </w:p>
+    <w:p>
+      <w:pPr>
+        <w:rPr>
+          <w:rFonts w:ascii="Times New Roman" w:eastAsia="Times New Roman" w:hAnsi="Times New Roman" w:cs="Times New Roman"/>
+          <w:color w:val="auto"/>
+          <w:sz w:val="24"/>
+          <w:szCs w:val="24"/>
+          <w:lang w:val="en-GB"/>
+        </w:rPr>
+      </w:pPr>
+      <w:r>
+        <w:rPr>
+          <w:rFonts w:ascii="Times New Roman" w:eastAsia="Times New Roman" w:hAnsi="Times New Roman" w:cs="Times New Roman"/>
+          <w:color w:val="auto"/>
+          <w:sz w:val="24"/>
+          <w:szCs w:val="24"/>
+          <w:lang w:val="en-GB"/>
+        </w:rPr>
+        <w:t>Router1(config-if)# exit</w:t>
+      </w:r>
+    </w:p>
+    <w:p>
+      <w:pPr>
+        <w:rPr>
+          <w:rFonts w:ascii="Times New Roman" w:eastAsia="Times New Roman" w:hAnsi="Times New Roman" w:cs="Times New Roman"/>
+          <w:color w:val="auto"/>
+          <w:sz w:val="24"/>
+          <w:szCs w:val="24"/>
+          <w:lang w:val="en-GB"/>
+        </w:rPr>
+      </w:pPr>
+      <w:r>
+        <w:rPr>
+          <w:rFonts w:ascii="Times New Roman" w:eastAsia="Times New Roman" w:hAnsi="Times New Roman" w:cs="Times New Roman"/>
+          <w:color w:val="auto"/>
+          <w:sz w:val="24"/>
+          <w:szCs w:val="24"/>
+          <w:lang w:val="en-GB"/>
+        </w:rPr>
+        <w:t>Router1# write</w:t>
+      </w:r>
+    </w:p>
+    <w:p>
+      <w:pPr>
+        <w:rPr>
+          <w:rFonts w:ascii="Times New Roman" w:eastAsia="Times New Roman" w:hAnsi="Times New Roman" w:cs="Times New Roman"/>
+          <w:color w:val="auto"/>
+          <w:sz w:val="24"/>
+          <w:szCs w:val="24"/>
+          <w:lang w:val="en-GB"/>
+        </w:rPr>
+      </w:pPr>
+    </w:p>
+    <w:p>
+      <w:pPr>
+        <w:rPr>
+          <w:rFonts w:ascii="Times New Roman" w:eastAsia="Times New Roman" w:hAnsi="Times New Roman" w:cs="Times New Roman"/>
+          <w:b/>
+          <w:bCs/>
+          <w:color w:val="auto"/>
+          <w:sz w:val="24"/>
+          <w:szCs w:val="24"/>
+        </w:rPr>
+      </w:pPr>
+      <w:r>
+        <w:rPr>
+          <w:rFonts w:ascii="Times New Roman" w:eastAsia="Times New Roman" w:hAnsi="Times New Roman" w:cs="Times New Roman"/>
+          <w:b/>
+          <w:bCs/>
+          <w:color w:val="auto"/>
+          <w:sz w:val="24"/>
+          <w:szCs w:val="24"/>
         </w:rPr>
         <w:t>Router 2 Configuration:</w:t>
       </w:r>
@@ -8138,7 +8442,29 @@
           <w:szCs w:val="24"/>
           <w:lang w:val="en-GB"/>
         </w:rPr>
-        <w:t>Router2(config-if)# ip address 172.16.30.1 255.255.255.0</w:t>
+        <w:t xml:space="preserve">Router2(config-if)# </w:t>
+      </w:r>
+      <w:proofErr w:type="spellStart"/>
+      <w:r>
+        <w:rPr>
+          <w:rFonts w:ascii="Times New Roman" w:eastAsia="Times New Roman" w:hAnsi="Times New Roman" w:cs="Times New Roman"/>
+          <w:color w:val="auto"/>
+          <w:sz w:val="24"/>
+          <w:szCs w:val="24"/>
+          <w:lang w:val="en-GB"/>
+        </w:rPr>
+        <w:t>ip</w:t>
+      </w:r>
+      <w:proofErr w:type="spellEnd"/>
+      <w:r>
+        <w:rPr>
+          <w:rFonts w:ascii="Times New Roman" w:eastAsia="Times New Roman" w:hAnsi="Times New Roman" w:cs="Times New Roman"/>
+          <w:color w:val="auto"/>
+          <w:sz w:val="24"/>
+          <w:szCs w:val="24"/>
+          <w:lang w:val="en-GB"/>
+        </w:rPr>
+        <w:t xml:space="preserve"> address 172.16.30.1 255.255.255.0</w:t>
       </w:r>
     </w:p>
     <w:p>
@@ -8222,7 +8548,29 @@
           <w:szCs w:val="24"/>
           <w:lang w:val="en-GB"/>
         </w:rPr>
-        <w:t>Router2(config-if)# ip address 172.16.40.1 255.255.255.0</w:t>
+        <w:t xml:space="preserve">Router2(config-if)# </w:t>
+      </w:r>
+      <w:proofErr w:type="spellStart"/>
+      <w:r>
+        <w:rPr>
+          <w:rFonts w:ascii="Times New Roman" w:eastAsia="Times New Roman" w:hAnsi="Times New Roman" w:cs="Times New Roman"/>
+          <w:color w:val="auto"/>
+          <w:sz w:val="24"/>
+          <w:szCs w:val="24"/>
+          <w:lang w:val="en-GB"/>
+        </w:rPr>
+        <w:t>ip</w:t>
+      </w:r>
+      <w:proofErr w:type="spellEnd"/>
+      <w:r>
+        <w:rPr>
+          <w:rFonts w:ascii="Times New Roman" w:eastAsia="Times New Roman" w:hAnsi="Times New Roman" w:cs="Times New Roman"/>
+          <w:color w:val="auto"/>
+          <w:sz w:val="24"/>
+          <w:szCs w:val="24"/>
+          <w:lang w:val="en-GB"/>
+        </w:rPr>
+        <w:t xml:space="preserve"> address 172.16.40.1 255.255.255.0</w:t>
       </w:r>
     </w:p>
     <w:p>
@@ -8493,19 +8841,9 @@
           <w:szCs w:val="24"/>
           <w:lang w:val="fr-FR"/>
         </w:rPr>
-        <w:t>Interface Configuration &amp; Routing Commands:</w:t>
-      </w:r>
-    </w:p>
-    <w:p>
-      <w:pPr>
-        <w:rPr>
-          <w:rFonts w:ascii="Times New Roman" w:eastAsia="Times New Roman" w:hAnsi="Times New Roman" w:cs="Times New Roman"/>
-          <w:color w:val="auto"/>
-          <w:sz w:val="24"/>
-          <w:szCs w:val="24"/>
-          <w:lang w:val="fr-FR"/>
-        </w:rPr>
-      </w:pPr>
+        <w:t xml:space="preserve">Interface Configuration &amp; </w:t>
+      </w:r>
+      <w:proofErr w:type="spellStart"/>
       <w:r>
         <w:rPr>
           <w:rFonts w:ascii="Times New Roman" w:eastAsia="Times New Roman" w:hAnsi="Times New Roman" w:cs="Times New Roman"/>
@@ -8516,232 +8854,10 @@
           <w:szCs w:val="24"/>
           <w:lang w:val="fr-FR"/>
         </w:rPr>
-        <w:t>Router 1 Configuration:</w:t>
-      </w:r>
-    </w:p>
-    <w:p>
-      <w:pPr>
-        <w:rPr>
-          <w:rFonts w:ascii="Times New Roman" w:eastAsia="Times New Roman" w:hAnsi="Times New Roman" w:cs="Times New Roman"/>
-          <w:color w:val="auto"/>
-          <w:sz w:val="24"/>
-          <w:szCs w:val="24"/>
-          <w:lang w:val="fr-FR"/>
-        </w:rPr>
-      </w:pPr>
-      <w:r>
-        <w:rPr>
-          <w:rFonts w:ascii="Times New Roman" w:eastAsia="Times New Roman" w:hAnsi="Times New Roman" w:cs="Times New Roman"/>
-          <w:color w:val="auto"/>
-          <w:sz w:val="24"/>
-          <w:szCs w:val="24"/>
-          <w:lang w:val="fr-FR"/>
-        </w:rPr>
-        <w:t>Router1# configure terminal</w:t>
-      </w:r>
-    </w:p>
-    <w:p>
-      <w:pPr>
-        <w:rPr>
-          <w:rFonts w:ascii="Times New Roman" w:eastAsia="Times New Roman" w:hAnsi="Times New Roman" w:cs="Times New Roman"/>
-          <w:color w:val="auto"/>
-          <w:sz w:val="24"/>
-          <w:szCs w:val="24"/>
-          <w:lang w:val="en-GB"/>
-        </w:rPr>
-      </w:pPr>
-      <w:r>
-        <w:rPr>
-          <w:rFonts w:ascii="Times New Roman" w:eastAsia="Times New Roman" w:hAnsi="Times New Roman" w:cs="Times New Roman"/>
-          <w:color w:val="auto"/>
-          <w:sz w:val="24"/>
-          <w:szCs w:val="24"/>
-          <w:lang w:val="en-GB"/>
-        </w:rPr>
-        <w:t>Router1(config)# interface Serial0/3/0</w:t>
-      </w:r>
-    </w:p>
-    <w:p>
-      <w:pPr>
-        <w:rPr>
-          <w:rFonts w:ascii="Times New Roman" w:eastAsia="Times New Roman" w:hAnsi="Times New Roman" w:cs="Times New Roman"/>
-          <w:color w:val="auto"/>
-          <w:sz w:val="24"/>
-          <w:szCs w:val="24"/>
-          <w:lang w:val="en-GB"/>
-        </w:rPr>
-      </w:pPr>
-      <w:r>
-        <w:rPr>
-          <w:rFonts w:ascii="Times New Roman" w:eastAsia="Times New Roman" w:hAnsi="Times New Roman" w:cs="Times New Roman"/>
-          <w:color w:val="auto"/>
-          <w:sz w:val="24"/>
-          <w:szCs w:val="24"/>
-          <w:lang w:val="en-GB"/>
-        </w:rPr>
-        <w:t>Router1(config-if)# ip address 10.10.10.1 255.255.255.252</w:t>
-      </w:r>
-    </w:p>
-    <w:p>
-      <w:pPr>
-        <w:rPr>
-          <w:rFonts w:ascii="Times New Roman" w:eastAsia="Times New Roman" w:hAnsi="Times New Roman" w:cs="Times New Roman"/>
-          <w:color w:val="auto"/>
-          <w:sz w:val="24"/>
-          <w:szCs w:val="24"/>
-          <w:lang w:val="en-GB"/>
-        </w:rPr>
-      </w:pPr>
-      <w:r>
-        <w:rPr>
-          <w:rFonts w:ascii="Times New Roman" w:eastAsia="Times New Roman" w:hAnsi="Times New Roman" w:cs="Times New Roman"/>
-          <w:color w:val="auto"/>
-          <w:sz w:val="24"/>
-          <w:szCs w:val="24"/>
-          <w:lang w:val="en-GB"/>
-        </w:rPr>
-        <w:t>Router1(config-if)# clock rate 64000</w:t>
-      </w:r>
-    </w:p>
-    <w:p>
-      <w:pPr>
-        <w:rPr>
-          <w:rFonts w:ascii="Times New Roman" w:eastAsia="Times New Roman" w:hAnsi="Times New Roman" w:cs="Times New Roman"/>
-          <w:color w:val="auto"/>
-          <w:sz w:val="24"/>
-          <w:szCs w:val="24"/>
-          <w:lang w:val="en-GB"/>
-        </w:rPr>
-      </w:pPr>
-      <w:r>
-        <w:rPr>
-          <w:rFonts w:ascii="Times New Roman" w:eastAsia="Times New Roman" w:hAnsi="Times New Roman" w:cs="Times New Roman"/>
-          <w:color w:val="auto"/>
-          <w:sz w:val="24"/>
-          <w:szCs w:val="24"/>
-          <w:lang w:val="en-GB"/>
-        </w:rPr>
-        <w:t>Router1(config-if)# no shutdown</w:t>
-      </w:r>
-    </w:p>
-    <w:p>
-      <w:pPr>
-        <w:rPr>
-          <w:rFonts w:ascii="Times New Roman" w:eastAsia="Times New Roman" w:hAnsi="Times New Roman" w:cs="Times New Roman"/>
-          <w:color w:val="auto"/>
-          <w:sz w:val="24"/>
-          <w:szCs w:val="24"/>
-          <w:lang w:val="en-GB"/>
-        </w:rPr>
-      </w:pPr>
-      <w:r>
-        <w:rPr>
-          <w:rFonts w:ascii="Times New Roman" w:eastAsia="Times New Roman" w:hAnsi="Times New Roman" w:cs="Times New Roman"/>
-          <w:color w:val="auto"/>
-          <w:sz w:val="24"/>
-          <w:szCs w:val="24"/>
-          <w:lang w:val="en-GB"/>
-        </w:rPr>
-        <w:t>Router1(config-if)# exit</w:t>
-      </w:r>
-    </w:p>
-    <w:p>
-      <w:pPr>
-        <w:rPr>
-          <w:rFonts w:ascii="Times New Roman" w:eastAsia="Times New Roman" w:hAnsi="Times New Roman" w:cs="Times New Roman"/>
-          <w:color w:val="auto"/>
-          <w:sz w:val="24"/>
-          <w:szCs w:val="24"/>
-          <w:lang w:val="fr-FR"/>
-        </w:rPr>
-      </w:pPr>
-      <w:r>
-        <w:rPr>
-          <w:rFonts w:ascii="Times New Roman" w:eastAsia="Times New Roman" w:hAnsi="Times New Roman" w:cs="Times New Roman"/>
-          <w:color w:val="auto"/>
-          <w:sz w:val="24"/>
-          <w:szCs w:val="24"/>
-          <w:lang w:val="fr-FR"/>
-        </w:rPr>
-        <w:t>Router1(config)# ip route 172.16.30.0 255.255.255.0 10.10.10.2</w:t>
-      </w:r>
-    </w:p>
-    <w:p>
-      <w:pPr>
-        <w:rPr>
-          <w:rFonts w:ascii="Times New Roman" w:eastAsia="Times New Roman" w:hAnsi="Times New Roman" w:cs="Times New Roman"/>
-          <w:color w:val="auto"/>
-          <w:sz w:val="24"/>
-          <w:szCs w:val="24"/>
-          <w:lang w:val="fr-FR"/>
-        </w:rPr>
-      </w:pPr>
-      <w:r>
-        <w:rPr>
-          <w:rFonts w:ascii="Times New Roman" w:eastAsia="Times New Roman" w:hAnsi="Times New Roman" w:cs="Times New Roman"/>
-          <w:color w:val="auto"/>
-          <w:sz w:val="24"/>
-          <w:szCs w:val="24"/>
-          <w:lang w:val="fr-FR"/>
-        </w:rPr>
-        <w:t>Router1(config)# ip route 172.16.40.0 255.255.255.0 10.10.10.2</w:t>
-      </w:r>
-    </w:p>
-    <w:p>
-      <w:pPr>
-        <w:rPr>
-          <w:rFonts w:ascii="Times New Roman" w:eastAsia="Times New Roman" w:hAnsi="Times New Roman" w:cs="Times New Roman"/>
-          <w:color w:val="auto"/>
-          <w:sz w:val="24"/>
-          <w:szCs w:val="24"/>
-          <w:lang w:val="en-GB"/>
-        </w:rPr>
-      </w:pPr>
-      <w:r>
-        <w:rPr>
-          <w:rFonts w:ascii="Times New Roman" w:eastAsia="Times New Roman" w:hAnsi="Times New Roman" w:cs="Times New Roman"/>
-          <w:color w:val="auto"/>
-          <w:sz w:val="24"/>
-          <w:szCs w:val="24"/>
-          <w:lang w:val="en-GB"/>
-        </w:rPr>
-        <w:t>Router1(config)# end</w:t>
-      </w:r>
-    </w:p>
-    <w:p>
-      <w:pPr>
-        <w:rPr>
-          <w:rFonts w:ascii="Times New Roman" w:eastAsia="Times New Roman" w:hAnsi="Times New Roman" w:cs="Times New Roman"/>
-          <w:color w:val="auto"/>
-          <w:sz w:val="24"/>
-          <w:szCs w:val="24"/>
-          <w:lang w:val="en-GB"/>
-        </w:rPr>
-      </w:pPr>
-      <w:r>
-        <w:rPr>
-          <w:rFonts w:ascii="Times New Roman" w:eastAsia="Times New Roman" w:hAnsi="Times New Roman" w:cs="Times New Roman"/>
-          <w:color w:val="auto"/>
-          <w:sz w:val="24"/>
-          <w:szCs w:val="24"/>
-          <w:lang w:val="en-GB"/>
-        </w:rPr>
-        <w:t>Router1# write</w:t>
-      </w:r>
-    </w:p>
-    <w:p>
-      <w:pPr>
-        <w:rPr>
-          <w:rFonts w:ascii="Times New Roman" w:eastAsia="Times New Roman" w:hAnsi="Times New Roman" w:cs="Times New Roman"/>
-          <w:color w:val="auto"/>
-          <w:sz w:val="24"/>
-          <w:szCs w:val="24"/>
-          <w:lang w:val="en-GB"/>
-        </w:rPr>
-      </w:pPr>
-    </w:p>
-    <w:p>
-      <w:pPr>
+        <w:t>Routing</w:t>
+      </w:r>
+      <w:proofErr w:type="spellEnd"/>
+      <w:r>
         <w:rPr>
           <w:rFonts w:ascii="Times New Roman" w:eastAsia="Times New Roman" w:hAnsi="Times New Roman" w:cs="Times New Roman"/>
           <w:b/>
@@ -8749,8 +8865,11 @@
           <w:color w:val="auto"/>
           <w:sz w:val="24"/>
           <w:szCs w:val="24"/>
-        </w:rPr>
-      </w:pPr>
+          <w:lang w:val="fr-FR"/>
+        </w:rPr>
+        <w:t xml:space="preserve"> </w:t>
+      </w:r>
+      <w:proofErr w:type="spellStart"/>
       <w:r>
         <w:rPr>
           <w:rFonts w:ascii="Times New Roman" w:eastAsia="Times New Roman" w:hAnsi="Times New Roman" w:cs="Times New Roman"/>
@@ -8759,6 +8878,353 @@
           <w:color w:val="auto"/>
           <w:sz w:val="24"/>
           <w:szCs w:val="24"/>
+          <w:lang w:val="fr-FR"/>
+        </w:rPr>
+        <w:t>Commands</w:t>
+      </w:r>
+      <w:proofErr w:type="spellEnd"/>
+      <w:r>
+        <w:rPr>
+          <w:rFonts w:ascii="Times New Roman" w:eastAsia="Times New Roman" w:hAnsi="Times New Roman" w:cs="Times New Roman"/>
+          <w:b/>
+          <w:bCs/>
+          <w:color w:val="auto"/>
+          <w:sz w:val="24"/>
+          <w:szCs w:val="24"/>
+          <w:lang w:val="fr-FR"/>
+        </w:rPr>
+        <w:t>:</w:t>
+      </w:r>
+    </w:p>
+    <w:p>
+      <w:pPr>
+        <w:rPr>
+          <w:rFonts w:ascii="Times New Roman" w:eastAsia="Times New Roman" w:hAnsi="Times New Roman" w:cs="Times New Roman"/>
+          <w:color w:val="auto"/>
+          <w:sz w:val="24"/>
+          <w:szCs w:val="24"/>
+          <w:lang w:val="fr-FR"/>
+        </w:rPr>
+      </w:pPr>
+      <w:r>
+        <w:rPr>
+          <w:rFonts w:ascii="Times New Roman" w:eastAsia="Times New Roman" w:hAnsi="Times New Roman" w:cs="Times New Roman"/>
+          <w:b/>
+          <w:bCs/>
+          <w:color w:val="auto"/>
+          <w:sz w:val="24"/>
+          <w:szCs w:val="24"/>
+          <w:lang w:val="fr-FR"/>
+        </w:rPr>
+        <w:t>Router 1 Configuration:</w:t>
+      </w:r>
+    </w:p>
+    <w:p>
+      <w:pPr>
+        <w:rPr>
+          <w:rFonts w:ascii="Times New Roman" w:eastAsia="Times New Roman" w:hAnsi="Times New Roman" w:cs="Times New Roman"/>
+          <w:color w:val="auto"/>
+          <w:sz w:val="24"/>
+          <w:szCs w:val="24"/>
+          <w:lang w:val="fr-FR"/>
+        </w:rPr>
+      </w:pPr>
+      <w:r>
+        <w:rPr>
+          <w:rFonts w:ascii="Times New Roman" w:eastAsia="Times New Roman" w:hAnsi="Times New Roman" w:cs="Times New Roman"/>
+          <w:color w:val="auto"/>
+          <w:sz w:val="24"/>
+          <w:szCs w:val="24"/>
+          <w:lang w:val="fr-FR"/>
+        </w:rPr>
+        <w:t>Router1# configure terminal</w:t>
+      </w:r>
+    </w:p>
+    <w:p>
+      <w:pPr>
+        <w:rPr>
+          <w:rFonts w:ascii="Times New Roman" w:eastAsia="Times New Roman" w:hAnsi="Times New Roman" w:cs="Times New Roman"/>
+          <w:color w:val="auto"/>
+          <w:sz w:val="24"/>
+          <w:szCs w:val="24"/>
+          <w:lang w:val="en-GB"/>
+        </w:rPr>
+      </w:pPr>
+      <w:r>
+        <w:rPr>
+          <w:rFonts w:ascii="Times New Roman" w:eastAsia="Times New Roman" w:hAnsi="Times New Roman" w:cs="Times New Roman"/>
+          <w:color w:val="auto"/>
+          <w:sz w:val="24"/>
+          <w:szCs w:val="24"/>
+          <w:lang w:val="en-GB"/>
+        </w:rPr>
+        <w:t>Router1(config)# interface Serial0/3/0</w:t>
+      </w:r>
+    </w:p>
+    <w:p>
+      <w:pPr>
+        <w:rPr>
+          <w:rFonts w:ascii="Times New Roman" w:eastAsia="Times New Roman" w:hAnsi="Times New Roman" w:cs="Times New Roman"/>
+          <w:color w:val="auto"/>
+          <w:sz w:val="24"/>
+          <w:szCs w:val="24"/>
+          <w:lang w:val="en-GB"/>
+        </w:rPr>
+      </w:pPr>
+      <w:r>
+        <w:rPr>
+          <w:rFonts w:ascii="Times New Roman" w:eastAsia="Times New Roman" w:hAnsi="Times New Roman" w:cs="Times New Roman"/>
+          <w:color w:val="auto"/>
+          <w:sz w:val="24"/>
+          <w:szCs w:val="24"/>
+          <w:lang w:val="en-GB"/>
+        </w:rPr>
+        <w:t xml:space="preserve">Router1(config-if)# </w:t>
+      </w:r>
+      <w:proofErr w:type="spellStart"/>
+      <w:r>
+        <w:rPr>
+          <w:rFonts w:ascii="Times New Roman" w:eastAsia="Times New Roman" w:hAnsi="Times New Roman" w:cs="Times New Roman"/>
+          <w:color w:val="auto"/>
+          <w:sz w:val="24"/>
+          <w:szCs w:val="24"/>
+          <w:lang w:val="en-GB"/>
+        </w:rPr>
+        <w:t>ip</w:t>
+      </w:r>
+      <w:proofErr w:type="spellEnd"/>
+      <w:r>
+        <w:rPr>
+          <w:rFonts w:ascii="Times New Roman" w:eastAsia="Times New Roman" w:hAnsi="Times New Roman" w:cs="Times New Roman"/>
+          <w:color w:val="auto"/>
+          <w:sz w:val="24"/>
+          <w:szCs w:val="24"/>
+          <w:lang w:val="en-GB"/>
+        </w:rPr>
+        <w:t xml:space="preserve"> address 10.10.10.1 255.255.255.252</w:t>
+      </w:r>
+    </w:p>
+    <w:p>
+      <w:pPr>
+        <w:rPr>
+          <w:rFonts w:ascii="Times New Roman" w:eastAsia="Times New Roman" w:hAnsi="Times New Roman" w:cs="Times New Roman"/>
+          <w:color w:val="auto"/>
+          <w:sz w:val="24"/>
+          <w:szCs w:val="24"/>
+          <w:lang w:val="en-GB"/>
+        </w:rPr>
+      </w:pPr>
+      <w:r>
+        <w:rPr>
+          <w:rFonts w:ascii="Times New Roman" w:eastAsia="Times New Roman" w:hAnsi="Times New Roman" w:cs="Times New Roman"/>
+          <w:color w:val="auto"/>
+          <w:sz w:val="24"/>
+          <w:szCs w:val="24"/>
+          <w:lang w:val="en-GB"/>
+        </w:rPr>
+        <w:t>Router1(config-if)# clock rate 64000</w:t>
+      </w:r>
+    </w:p>
+    <w:p>
+      <w:pPr>
+        <w:rPr>
+          <w:rFonts w:ascii="Times New Roman" w:eastAsia="Times New Roman" w:hAnsi="Times New Roman" w:cs="Times New Roman"/>
+          <w:color w:val="auto"/>
+          <w:sz w:val="24"/>
+          <w:szCs w:val="24"/>
+          <w:lang w:val="en-GB"/>
+        </w:rPr>
+      </w:pPr>
+      <w:r>
+        <w:rPr>
+          <w:rFonts w:ascii="Times New Roman" w:eastAsia="Times New Roman" w:hAnsi="Times New Roman" w:cs="Times New Roman"/>
+          <w:color w:val="auto"/>
+          <w:sz w:val="24"/>
+          <w:szCs w:val="24"/>
+          <w:lang w:val="en-GB"/>
+        </w:rPr>
+        <w:t>Router1(config-if)# no shutdown</w:t>
+      </w:r>
+    </w:p>
+    <w:p>
+      <w:pPr>
+        <w:rPr>
+          <w:rFonts w:ascii="Times New Roman" w:eastAsia="Times New Roman" w:hAnsi="Times New Roman" w:cs="Times New Roman"/>
+          <w:color w:val="auto"/>
+          <w:sz w:val="24"/>
+          <w:szCs w:val="24"/>
+          <w:lang w:val="en-GB"/>
+        </w:rPr>
+      </w:pPr>
+      <w:r>
+        <w:rPr>
+          <w:rFonts w:ascii="Times New Roman" w:eastAsia="Times New Roman" w:hAnsi="Times New Roman" w:cs="Times New Roman"/>
+          <w:color w:val="auto"/>
+          <w:sz w:val="24"/>
+          <w:szCs w:val="24"/>
+          <w:lang w:val="en-GB"/>
+        </w:rPr>
+        <w:t>Router1(config-if)# exit</w:t>
+      </w:r>
+    </w:p>
+    <w:p>
+      <w:pPr>
+        <w:rPr>
+          <w:rFonts w:ascii="Times New Roman" w:eastAsia="Times New Roman" w:hAnsi="Times New Roman" w:cs="Times New Roman"/>
+          <w:color w:val="auto"/>
+          <w:sz w:val="24"/>
+          <w:szCs w:val="24"/>
+          <w:lang w:val="fr-FR"/>
+        </w:rPr>
+      </w:pPr>
+      <w:r>
+        <w:rPr>
+          <w:rFonts w:ascii="Times New Roman" w:eastAsia="Times New Roman" w:hAnsi="Times New Roman" w:cs="Times New Roman"/>
+          <w:color w:val="auto"/>
+          <w:sz w:val="24"/>
+          <w:szCs w:val="24"/>
+          <w:lang w:val="fr-FR"/>
+        </w:rPr>
+        <w:t xml:space="preserve">Router1(config)# </w:t>
+      </w:r>
+      <w:proofErr w:type="spellStart"/>
+      <w:r>
+        <w:rPr>
+          <w:rFonts w:ascii="Times New Roman" w:eastAsia="Times New Roman" w:hAnsi="Times New Roman" w:cs="Times New Roman"/>
+          <w:color w:val="auto"/>
+          <w:sz w:val="24"/>
+          <w:szCs w:val="24"/>
+          <w:lang w:val="fr-FR"/>
+        </w:rPr>
+        <w:t>ip</w:t>
+      </w:r>
+      <w:proofErr w:type="spellEnd"/>
+      <w:r>
+        <w:rPr>
+          <w:rFonts w:ascii="Times New Roman" w:eastAsia="Times New Roman" w:hAnsi="Times New Roman" w:cs="Times New Roman"/>
+          <w:color w:val="auto"/>
+          <w:sz w:val="24"/>
+          <w:szCs w:val="24"/>
+          <w:lang w:val="fr-FR"/>
+        </w:rPr>
+        <w:t xml:space="preserve"> route 172.16.30.0 255.255.255.0 10.10.10.2</w:t>
+      </w:r>
+    </w:p>
+    <w:p>
+      <w:pPr>
+        <w:rPr>
+          <w:rFonts w:ascii="Times New Roman" w:eastAsia="Times New Roman" w:hAnsi="Times New Roman" w:cs="Times New Roman"/>
+          <w:color w:val="auto"/>
+          <w:sz w:val="24"/>
+          <w:szCs w:val="24"/>
+          <w:lang w:val="fr-FR"/>
+        </w:rPr>
+      </w:pPr>
+      <w:r>
+        <w:rPr>
+          <w:rFonts w:ascii="Times New Roman" w:eastAsia="Times New Roman" w:hAnsi="Times New Roman" w:cs="Times New Roman"/>
+          <w:color w:val="auto"/>
+          <w:sz w:val="24"/>
+          <w:szCs w:val="24"/>
+          <w:lang w:val="fr-FR"/>
+        </w:rPr>
+        <w:t xml:space="preserve">Router1(config)# </w:t>
+      </w:r>
+      <w:proofErr w:type="spellStart"/>
+      <w:r>
+        <w:rPr>
+          <w:rFonts w:ascii="Times New Roman" w:eastAsia="Times New Roman" w:hAnsi="Times New Roman" w:cs="Times New Roman"/>
+          <w:color w:val="auto"/>
+          <w:sz w:val="24"/>
+          <w:szCs w:val="24"/>
+          <w:lang w:val="fr-FR"/>
+        </w:rPr>
+        <w:t>ip</w:t>
+      </w:r>
+      <w:proofErr w:type="spellEnd"/>
+      <w:r>
+        <w:rPr>
+          <w:rFonts w:ascii="Times New Roman" w:eastAsia="Times New Roman" w:hAnsi="Times New Roman" w:cs="Times New Roman"/>
+          <w:color w:val="auto"/>
+          <w:sz w:val="24"/>
+          <w:szCs w:val="24"/>
+          <w:lang w:val="fr-FR"/>
+        </w:rPr>
+        <w:t xml:space="preserve"> route 172.16.40.0 255.255.255.0 10.10.10.2</w:t>
+      </w:r>
+    </w:p>
+    <w:p>
+      <w:pPr>
+        <w:rPr>
+          <w:rFonts w:ascii="Times New Roman" w:eastAsia="Times New Roman" w:hAnsi="Times New Roman" w:cs="Times New Roman"/>
+          <w:color w:val="auto"/>
+          <w:sz w:val="24"/>
+          <w:szCs w:val="24"/>
+          <w:lang w:val="en-GB"/>
+        </w:rPr>
+      </w:pPr>
+      <w:r>
+        <w:rPr>
+          <w:rFonts w:ascii="Times New Roman" w:eastAsia="Times New Roman" w:hAnsi="Times New Roman" w:cs="Times New Roman"/>
+          <w:color w:val="auto"/>
+          <w:sz w:val="24"/>
+          <w:szCs w:val="24"/>
+          <w:lang w:val="en-GB"/>
+        </w:rPr>
+        <w:t>Router1(config)# end</w:t>
+      </w:r>
+    </w:p>
+    <w:p>
+      <w:pPr>
+        <w:rPr>
+          <w:rFonts w:ascii="Times New Roman" w:eastAsia="Times New Roman" w:hAnsi="Times New Roman" w:cs="Times New Roman"/>
+          <w:color w:val="auto"/>
+          <w:sz w:val="24"/>
+          <w:szCs w:val="24"/>
+          <w:lang w:val="en-GB"/>
+        </w:rPr>
+      </w:pPr>
+      <w:r>
+        <w:rPr>
+          <w:rFonts w:ascii="Times New Roman" w:eastAsia="Times New Roman" w:hAnsi="Times New Roman" w:cs="Times New Roman"/>
+          <w:color w:val="auto"/>
+          <w:sz w:val="24"/>
+          <w:szCs w:val="24"/>
+          <w:lang w:val="en-GB"/>
+        </w:rPr>
+        <w:t>Router1# write</w:t>
+      </w:r>
+    </w:p>
+    <w:p>
+      <w:pPr>
+        <w:rPr>
+          <w:rFonts w:ascii="Times New Roman" w:eastAsia="Times New Roman" w:hAnsi="Times New Roman" w:cs="Times New Roman"/>
+          <w:color w:val="auto"/>
+          <w:sz w:val="24"/>
+          <w:szCs w:val="24"/>
+          <w:lang w:val="en-GB"/>
+        </w:rPr>
+      </w:pPr>
+    </w:p>
+    <w:p>
+      <w:pPr>
+        <w:rPr>
+          <w:rFonts w:ascii="Times New Roman" w:eastAsia="Times New Roman" w:hAnsi="Times New Roman" w:cs="Times New Roman"/>
+          <w:b/>
+          <w:bCs/>
+          <w:color w:val="auto"/>
+          <w:sz w:val="24"/>
+          <w:szCs w:val="24"/>
+        </w:rPr>
+      </w:pPr>
+      <w:r>
+        <w:rPr>
+          <w:rFonts w:ascii="Times New Roman" w:eastAsia="Times New Roman" w:hAnsi="Times New Roman" w:cs="Times New Roman"/>
+          <w:b/>
+          <w:bCs/>
+          <w:color w:val="auto"/>
+          <w:sz w:val="24"/>
+          <w:szCs w:val="24"/>
         </w:rPr>
         <w:t>Router 2 Configuration:</w:t>
       </w:r>
@@ -8823,7 +9289,29 @@
           <w:szCs w:val="24"/>
           <w:lang w:val="en-GB"/>
         </w:rPr>
-        <w:t>Router2(config-if)# ip address 10.10.10.2 255.255.255.252</w:t>
+        <w:t xml:space="preserve">Router2(config-if)# </w:t>
+      </w:r>
+      <w:proofErr w:type="spellStart"/>
+      <w:r>
+        <w:rPr>
+          <w:rFonts w:ascii="Times New Roman" w:eastAsia="Times New Roman" w:hAnsi="Times New Roman" w:cs="Times New Roman"/>
+          <w:color w:val="auto"/>
+          <w:sz w:val="24"/>
+          <w:szCs w:val="24"/>
+          <w:lang w:val="en-GB"/>
+        </w:rPr>
+        <w:t>ip</w:t>
+      </w:r>
+      <w:proofErr w:type="spellEnd"/>
+      <w:r>
+        <w:rPr>
+          <w:rFonts w:ascii="Times New Roman" w:eastAsia="Times New Roman" w:hAnsi="Times New Roman" w:cs="Times New Roman"/>
+          <w:color w:val="auto"/>
+          <w:sz w:val="24"/>
+          <w:szCs w:val="24"/>
+          <w:lang w:val="en-GB"/>
+        </w:rPr>
+        <w:t xml:space="preserve"> address 10.10.10.2 255.255.255.252</w:t>
       </w:r>
     </w:p>
     <w:p>
@@ -8886,11 +9374,10 @@
           <w:szCs w:val="24"/>
           <w:lang w:val="fr-FR"/>
         </w:rPr>
-        <w:t>Router2(config)# ip route 172.16.10.0 255.255.255.0 10.10.10.1</w:t>
-      </w:r>
-    </w:p>
-    <w:p>
-      <w:pPr>
+        <w:t xml:space="preserve">Router2(config)# </w:t>
+      </w:r>
+      <w:proofErr w:type="spellStart"/>
+      <w:r>
         <w:rPr>
           <w:rFonts w:ascii="Times New Roman" w:eastAsia="Times New Roman" w:hAnsi="Times New Roman" w:cs="Times New Roman"/>
           <w:color w:val="auto"/>
@@ -8898,7 +9385,9 @@
           <w:szCs w:val="24"/>
           <w:lang w:val="fr-FR"/>
         </w:rPr>
-      </w:pPr>
+        <w:t>ip</w:t>
+      </w:r>
+      <w:proofErr w:type="spellEnd"/>
       <w:r>
         <w:rPr>
           <w:rFonts w:ascii="Times New Roman" w:eastAsia="Times New Roman" w:hAnsi="Times New Roman" w:cs="Times New Roman"/>
@@ -8907,7 +9396,50 @@
           <w:szCs w:val="24"/>
           <w:lang w:val="fr-FR"/>
         </w:rPr>
-        <w:t>Router2(config)# ip route 172.16.20.0 255.255.255.0 10.10.10.1</w:t>
+        <w:t xml:space="preserve"> route 172.16.10.0 255.255.255.0 10.10.10.1</w:t>
+      </w:r>
+    </w:p>
+    <w:p>
+      <w:pPr>
+        <w:rPr>
+          <w:rFonts w:ascii="Times New Roman" w:eastAsia="Times New Roman" w:hAnsi="Times New Roman" w:cs="Times New Roman"/>
+          <w:color w:val="auto"/>
+          <w:sz w:val="24"/>
+          <w:szCs w:val="24"/>
+          <w:lang w:val="fr-FR"/>
+        </w:rPr>
+      </w:pPr>
+      <w:r>
+        <w:rPr>
+          <w:rFonts w:ascii="Times New Roman" w:eastAsia="Times New Roman" w:hAnsi="Times New Roman" w:cs="Times New Roman"/>
+          <w:color w:val="auto"/>
+          <w:sz w:val="24"/>
+          <w:szCs w:val="24"/>
+          <w:lang w:val="fr-FR"/>
+        </w:rPr>
+        <w:t xml:space="preserve">Router2(config)# </w:t>
+      </w:r>
+      <w:proofErr w:type="spellStart"/>
+      <w:r>
+        <w:rPr>
+          <w:rFonts w:ascii="Times New Roman" w:eastAsia="Times New Roman" w:hAnsi="Times New Roman" w:cs="Times New Roman"/>
+          <w:color w:val="auto"/>
+          <w:sz w:val="24"/>
+          <w:szCs w:val="24"/>
+          <w:lang w:val="fr-FR"/>
+        </w:rPr>
+        <w:t>ip</w:t>
+      </w:r>
+      <w:proofErr w:type="spellEnd"/>
+      <w:r>
+        <w:rPr>
+          <w:rFonts w:ascii="Times New Roman" w:eastAsia="Times New Roman" w:hAnsi="Times New Roman" w:cs="Times New Roman"/>
+          <w:color w:val="auto"/>
+          <w:sz w:val="24"/>
+          <w:szCs w:val="24"/>
+          <w:lang w:val="fr-FR"/>
+        </w:rPr>
+        <w:t xml:space="preserve"> route 172.16.20.0 255.255.255.0 10.10.10.1</w:t>
       </w:r>
     </w:p>
     <w:p>
@@ -9777,7 +10309,33 @@
           <w:szCs w:val="24"/>
           <w:lang w:val="en-GB"/>
         </w:rPr>
-        <w:t>Methodology and Architectural Tradeoffs:</w:t>
+        <w:t xml:space="preserve">Methodology and Architectural </w:t>
+      </w:r>
+      <w:proofErr w:type="spellStart"/>
+      <w:r>
+        <w:rPr>
+          <w:rFonts w:ascii="Times New Roman" w:eastAsia="Times New Roman" w:hAnsi="Times New Roman" w:cs="Times New Roman"/>
+          <w:b/>
+          <w:bCs/>
+          <w:color w:val="auto"/>
+          <w:sz w:val="24"/>
+          <w:szCs w:val="24"/>
+          <w:lang w:val="en-GB"/>
+        </w:rPr>
+        <w:t>Tradeoffs</w:t>
+      </w:r>
+      <w:proofErr w:type="spellEnd"/>
+      <w:r>
+        <w:rPr>
+          <w:rFonts w:ascii="Times New Roman" w:eastAsia="Times New Roman" w:hAnsi="Times New Roman" w:cs="Times New Roman"/>
+          <w:b/>
+          <w:bCs/>
+          <w:color w:val="auto"/>
+          <w:sz w:val="24"/>
+          <w:szCs w:val="24"/>
+          <w:lang w:val="en-GB"/>
+        </w:rPr>
+        <w:t>:</w:t>
       </w:r>
     </w:p>
     <w:p>
@@ -9801,7 +10359,29 @@
           <w:szCs w:val="24"/>
           <w:lang w:val="en-GB"/>
         </w:rPr>
-        <w:t xml:space="preserve">We selected Static Routing over dynamic protocols like RIP or OSPF for interconnecting WAN 1 and WAN 2. Static routing was chosen because our topology consists of a simple point-to-point serial connection with fixed networks. This approach eliminates protocol overhead, conserves CPU and RAM resources on routers, and guarantees predictable packet paths without convergence delays. The tradeoff involved manual configuration effort for each network prefix, which is manageable for four LANs but would become inefficient in larger, dynamically changing network environments. </w:t>
+        <w:t xml:space="preserve">We selected Static Routing over dynamic protocols like RIP or OSPF for interconnecting WAN 1 and WAN 2. Static routing was chosen because our topology consists of a simple point-to-point serial connection with fixed networks. This approach eliminates protocol overhead, conserves CPU and RAM resources on routers, and guarantees predictable packet paths without convergence delays. The </w:t>
+      </w:r>
+      <w:proofErr w:type="spellStart"/>
+      <w:r>
+        <w:rPr>
+          <w:rFonts w:ascii="Times New Roman" w:eastAsia="Times New Roman" w:hAnsi="Times New Roman" w:cs="Times New Roman"/>
+          <w:color w:val="auto"/>
+          <w:sz w:val="24"/>
+          <w:szCs w:val="24"/>
+          <w:lang w:val="en-GB"/>
+        </w:rPr>
+        <w:t>tradeoff</w:t>
+      </w:r>
+      <w:proofErr w:type="spellEnd"/>
+      <w:r>
+        <w:rPr>
+          <w:rFonts w:ascii="Times New Roman" w:eastAsia="Times New Roman" w:hAnsi="Times New Roman" w:cs="Times New Roman"/>
+          <w:color w:val="auto"/>
+          <w:sz w:val="24"/>
+          <w:szCs w:val="24"/>
+          <w:lang w:val="en-GB"/>
+        </w:rPr>
+        <w:t xml:space="preserve"> involved manual configuration effort for each network prefix, which is manageable for four LANs but would become inefficient in larger, dynamically changing network environments. </w:t>
       </w:r>
     </w:p>
     <w:p>
@@ -9954,6 +10534,32 @@
         </w:rPr>
         <w:t xml:space="preserve">Live report document(with edit history): </w:t>
       </w:r>
+      <w:hyperlink r:id="rId23" w:history="1">
+        <w:r>
+          <w:rPr>
+            <w:rStyle w:val="Hyperlink"/>
+            <w:rFonts w:ascii="Times New Roman" w:eastAsia="Times New Roman" w:hAnsi="Times New Roman" w:cs="Times New Roman"/>
+            <w:b/>
+            <w:bCs/>
+            <w:sz w:val="24"/>
+            <w:szCs w:val="24"/>
+            <w:lang w:val="en-GB"/>
+          </w:rPr>
+          <w:t>https://docs.google.com/document/d/1cD3vTF9kRJOB4hBoFSM7L6TElytTtKMtsAJzWnT8XPY/edit?usp=sharing</w:t>
+        </w:r>
+      </w:hyperlink>
+      <w:r>
+        <w:rPr>
+          <w:rFonts w:ascii="Times New Roman" w:eastAsia="Times New Roman" w:hAnsi="Times New Roman" w:cs="Times New Roman"/>
+          <w:b/>
+          <w:bCs/>
+          <w:color w:val="auto"/>
+          <w:sz w:val="24"/>
+          <w:szCs w:val="24"/>
+          <w:lang w:val="en-GB"/>
+        </w:rPr>
+        <w:t xml:space="preserve"> </w:t>
+      </w:r>
     </w:p>
     <w:p>
       <w:pPr>
@@ -9987,6 +10593,35 @@
         </w:rPr>
         <w:t>GitHub/GitLab repository(with commit history):</w:t>
       </w:r>
+      <w:r>
+        <w:t xml:space="preserve"> </w:t>
+      </w:r>
+      <w:hyperlink r:id="rId24" w:history="1">
+        <w:r>
+          <w:rPr>
+            <w:rStyle w:val="Hyperlink"/>
+            <w:rFonts w:ascii="Times New Roman" w:eastAsia="Times New Roman" w:hAnsi="Times New Roman" w:cs="Times New Roman"/>
+            <w:b/>
+            <w:bCs/>
+            <w:sz w:val="24"/>
+            <w:szCs w:val="24"/>
+            <w:lang w:val="en-GB"/>
+          </w:rPr>
+          <w:t>https://github.com/moawadh2018-arch/CS360-Project-Phase2</w:t>
+        </w:r>
+      </w:hyperlink>
+      <w:r>
+        <w:rPr>
+          <w:rFonts w:ascii="Times New Roman" w:eastAsia="Times New Roman" w:hAnsi="Times New Roman" w:cs="Times New Roman"/>
+          <w:b/>
+          <w:bCs/>
+          <w:color w:val="auto"/>
+          <w:sz w:val="24"/>
+          <w:szCs w:val="24"/>
+          <w:lang w:val="en-GB"/>
+        </w:rPr>
+        <w:t xml:space="preserve"> </w:t>
+      </w:r>
     </w:p>
     <w:p>
       <w:pPr>
@@ -10005,7 +10640,6 @@
           <w:color w:val="auto"/>
           <w:sz w:val="24"/>
           <w:szCs w:val="24"/>
-          <w:rtl/>
           <w:lang w:val="en-GB"/>
         </w:rPr>
       </w:pPr>
@@ -10019,14 +10653,107 @@
           <w:szCs w:val="24"/>
           <w:lang w:val="en-GB"/>
         </w:rPr>
-        <w:t>Packet Tracer project file(.pkt):</w:t>
-      </w:r>
+        <w:t>Packet Tracer project file(.</w:t>
+      </w:r>
+      <w:proofErr w:type="spellStart"/>
+      <w:r>
+        <w:rPr>
+          <w:rFonts w:ascii="Times New Roman" w:eastAsia="Times New Roman" w:hAnsi="Times New Roman" w:cs="Times New Roman"/>
+          <w:b/>
+          <w:bCs/>
+          <w:color w:val="auto"/>
+          <w:sz w:val="24"/>
+          <w:szCs w:val="24"/>
+          <w:lang w:val="en-GB"/>
+        </w:rPr>
+        <w:t>pkt</w:t>
+      </w:r>
+      <w:proofErr w:type="spellEnd"/>
+      <w:r>
+        <w:rPr>
+          <w:rFonts w:ascii="Times New Roman" w:eastAsia="Times New Roman" w:hAnsi="Times New Roman" w:cs="Times New Roman"/>
+          <w:b/>
+          <w:bCs/>
+          <w:color w:val="auto"/>
+          <w:sz w:val="24"/>
+          <w:szCs w:val="24"/>
+          <w:lang w:val="en-GB"/>
+        </w:rPr>
+        <w:t>):</w:t>
+      </w:r>
+      <w:r>
+        <w:rPr>
+          <w:rFonts w:ascii="Times New Roman" w:eastAsia="Times New Roman" w:hAnsi="Times New Roman" w:cs="Times New Roman"/>
+          <w:b/>
+          <w:bCs/>
+          <w:color w:val="auto"/>
+          <w:sz w:val="24"/>
+          <w:szCs w:val="24"/>
+          <w:lang w:val="en-GB"/>
+        </w:rPr>
+        <w:t xml:space="preserve"> </w:t>
+      </w:r>
+      <w:r>
+        <w:rPr>
+          <w:rFonts w:ascii="Times New Roman" w:eastAsia="Times New Roman" w:hAnsi="Times New Roman" w:cs="Times New Roman"/>
+          <w:b/>
+          <w:bCs/>
+          <w:color w:val="auto"/>
+          <w:sz w:val="24"/>
+          <w:szCs w:val="24"/>
+          <w:lang w:val="en-GB"/>
+        </w:rPr>
+        <w:t>Included in the GitHub repository above (Network_Phase2.pkt)</w:t>
+      </w:r>
+      <w:r>
+        <w:rPr>
+          <w:rFonts w:ascii="Times New Roman" w:eastAsia="Times New Roman" w:hAnsi="Times New Roman" w:cs="Times New Roman"/>
+          <w:b/>
+          <w:bCs/>
+          <w:color w:val="auto"/>
+          <w:sz w:val="24"/>
+          <w:szCs w:val="24"/>
+          <w:lang w:val="en-GB"/>
+        </w:rPr>
+        <w:t xml:space="preserve"> </w:t>
+      </w:r>
+    </w:p>
+    <w:p>
+      <w:pPr>
+        <w:pStyle w:val="af5"/>
+        <w:rPr>
+          <w:rFonts w:ascii="Times New Roman" w:eastAsia="Times New Roman" w:hAnsi="Times New Roman" w:cs="Times New Roman"/>
+          <w:b/>
+          <w:bCs/>
+          <w:color w:val="auto"/>
+          <w:sz w:val="24"/>
+          <w:szCs w:val="24"/>
+          <w:lang w:val="en-GB"/>
+        </w:rPr>
+      </w:pPr>
+    </w:p>
+    <w:p>
+      <w:pPr>
+        <w:tabs>
+          <w:tab w:val="left" w:pos="1008"/>
+        </w:tabs>
+        <w:rPr>
+          <w:rFonts w:ascii="Times New Roman" w:eastAsia="Times New Roman" w:hAnsi="Times New Roman" w:cs="Times New Roman"/>
+          <w:b/>
+          <w:bCs/>
+          <w:color w:val="auto"/>
+          <w:sz w:val="24"/>
+          <w:szCs w:val="24"/>
+          <w:rtl/>
+          <w:lang w:val="en-GB"/>
+        </w:rPr>
+      </w:pPr>
     </w:p>
     <w:sectPr>
-      <w:headerReference w:type="default" r:id="rId23"/>
-      <w:footerReference w:type="even" r:id="rId24"/>
-      <w:footerReference w:type="default" r:id="rId25"/>
-      <w:footerReference w:type="first" r:id="rId26"/>
+      <w:headerReference w:type="default" r:id="rId25"/>
+      <w:footerReference w:type="even" r:id="rId26"/>
+      <w:footerReference w:type="default" r:id="rId27"/>
+      <w:footerReference w:type="first" r:id="rId28"/>
       <w:pgSz w:w="12240" w:h="15840" w:code="1"/>
       <w:pgMar w:top="1080" w:right="720" w:bottom="2160" w:left="3096" w:header="1080" w:footer="720" w:gutter="0"/>
       <w:pgNumType w:start="1"/>
@@ -14604,6 +15331,7 @@
     <w:rsid w:val="00355414"/>
     <w:rsid w:val="00396450"/>
     <w:rsid w:val="004A7EE6"/>
+    <w:rsid w:val="004E2D8B"/>
     <w:rsid w:val="004E4D7A"/>
     <w:rsid w:val="004F2126"/>
     <w:rsid w:val="00522378"/>
@@ -14635,7 +15363,6 @@
     <w:rsid w:val="00D02BF5"/>
     <w:rsid w:val="00D248BA"/>
     <w:rsid w:val="00D56FB7"/>
-    <w:rsid w:val="00DB2FEC"/>
     <w:rsid w:val="00E02997"/>
     <w:rsid w:val="00E552F8"/>
     <w:rsid w:val="00E97C42"/>

</xml_diff>